<commit_message>
Improve booking and coworking forms
</commit_message>
<xml_diff>
--- a/КП_Сусло_Антон(пояснительная записка).docx
+++ b/КП_Сусло_Антон(пояснительная записка).docx
@@ -2806,11 +2806,21 @@
           <w:pPr>
             <w:pStyle w:val="af"/>
             <w:jc w:val="center"/>
+            <w:rPr>
+              <w:b/>
+              <w:bCs/>
+              <w:sz w:val="28"/>
+              <w:szCs w:val="28"/>
+            </w:rPr>
           </w:pPr>
           <w:r>
             <w:rPr>
               <w:rFonts w:ascii="Times New Roman" w:hAnsi="Times New Roman" w:cs="Times New Roman"/>
+              <w:b/>
+              <w:bCs/>
               <w:color w:val="auto"/>
+              <w:sz w:val="28"/>
+              <w:szCs w:val="28"/>
             </w:rPr>
             <w:t>Содержание</w:t>
           </w:r>
@@ -2838,119 +2848,89 @@
           <w:r>
             <w:fldChar w:fldCharType="separate"/>
           </w:r>
-          <w:r>
-            <w:rPr>
-              <w:noProof/>
-            </w:rPr>
-            <w:fldChar w:fldCharType="begin"/>
-          </w:r>
-          <w:r>
-            <w:rPr>
-              <w:noProof/>
-            </w:rPr>
-            <w:instrText xml:space="preserve"> HYPERLINK \l "_Toc232646698" </w:instrText>
-          </w:r>
-          <w:r>
-            <w:rPr>
-              <w:noProof/>
-            </w:rPr>
-          </w:r>
-          <w:r>
-            <w:rPr>
-              <w:noProof/>
-            </w:rPr>
-            <w:fldChar w:fldCharType="separate"/>
-          </w:r>
-          <w:r>
-            <w:rPr>
-              <w:rStyle w:val="ad"/>
-              <w:rFonts w:ascii="Times New Roman" w:eastAsia="Times New Roman" w:hAnsi="Times New Roman" w:cs="Times New Roman"/>
-              <w:b/>
-              <w:bCs/>
-              <w:noProof/>
-              <w:sz w:val="28"/>
-              <w:szCs w:val="28"/>
-            </w:rPr>
-            <w:t>ВВЕДЕНИЕ</w:t>
-          </w:r>
-          <w:r>
-            <w:rPr>
-              <w:rFonts w:ascii="Times New Roman" w:hAnsi="Times New Roman" w:cs="Times New Roman"/>
-              <w:noProof/>
-              <w:webHidden/>
-              <w:sz w:val="28"/>
-              <w:szCs w:val="28"/>
-            </w:rPr>
-            <w:tab/>
-          </w:r>
-          <w:r>
-            <w:rPr>
-              <w:rFonts w:ascii="Times New Roman" w:hAnsi="Times New Roman" w:cs="Times New Roman"/>
-              <w:noProof/>
-              <w:webHidden/>
-              <w:sz w:val="28"/>
-              <w:szCs w:val="28"/>
-            </w:rPr>
-            <w:fldChar w:fldCharType="begin"/>
-          </w:r>
-          <w:r>
-            <w:rPr>
-              <w:rFonts w:ascii="Times New Roman" w:hAnsi="Times New Roman" w:cs="Times New Roman"/>
-              <w:noProof/>
-              <w:webHidden/>
-              <w:sz w:val="28"/>
-              <w:szCs w:val="28"/>
-            </w:rPr>
-            <w:instrText xml:space="preserve"> PAGEREF _Toc232646698 \h </w:instrText>
-          </w:r>
-          <w:r>
-            <w:rPr>
-              <w:rFonts w:ascii="Times New Roman" w:hAnsi="Times New Roman" w:cs="Times New Roman"/>
-              <w:noProof/>
-              <w:webHidden/>
-              <w:sz w:val="28"/>
-              <w:szCs w:val="28"/>
-            </w:rPr>
-          </w:r>
-          <w:r>
-            <w:rPr>
-              <w:rFonts w:ascii="Times New Roman" w:hAnsi="Times New Roman" w:cs="Times New Roman"/>
-              <w:noProof/>
-              <w:webHidden/>
-              <w:sz w:val="28"/>
-              <w:szCs w:val="28"/>
-            </w:rPr>
-            <w:fldChar w:fldCharType="separate"/>
-          </w:r>
-          <w:r>
-            <w:rPr>
-              <w:rFonts w:ascii="Times New Roman" w:hAnsi="Times New Roman" w:cs="Times New Roman"/>
-              <w:noProof/>
-              <w:webHidden/>
-              <w:sz w:val="28"/>
-              <w:szCs w:val="28"/>
-            </w:rPr>
-            <w:t>5</w:t>
-          </w:r>
-          <w:r>
-            <w:rPr>
-              <w:rFonts w:ascii="Times New Roman" w:hAnsi="Times New Roman" w:cs="Times New Roman"/>
-              <w:noProof/>
-              <w:webHidden/>
-              <w:sz w:val="28"/>
-              <w:szCs w:val="28"/>
-            </w:rPr>
-            <w:fldChar w:fldCharType="end"/>
-          </w:r>
-          <w:r>
-            <w:rPr>
-              <w:rFonts w:ascii="Times New Roman" w:hAnsi="Times New Roman" w:cs="Times New Roman"/>
-              <w:noProof/>
-              <w:sz w:val="28"/>
-              <w:szCs w:val="28"/>
-            </w:rPr>
-            <w:fldChar w:fldCharType="end"/>
-          </w:r>
+          <w:hyperlink w:anchor="_Toc232646698" w:history="1">
+            <w:r>
+              <w:rPr>
+                <w:rStyle w:val="ad"/>
+                <w:rFonts w:ascii="Times New Roman" w:eastAsia="Times New Roman" w:hAnsi="Times New Roman" w:cs="Times New Roman"/>
+                <w:b/>
+                <w:bCs/>
+                <w:noProof/>
+                <w:sz w:val="28"/>
+                <w:szCs w:val="28"/>
+              </w:rPr>
+              <w:t>ВВЕДЕНИЕ</w:t>
+            </w:r>
+            <w:r>
+              <w:rPr>
+                <w:rFonts w:ascii="Times New Roman" w:hAnsi="Times New Roman" w:cs="Times New Roman"/>
+                <w:noProof/>
+                <w:webHidden/>
+                <w:sz w:val="28"/>
+                <w:szCs w:val="28"/>
+              </w:rPr>
+              <w:tab/>
+            </w:r>
+            <w:r>
+              <w:rPr>
+                <w:rFonts w:ascii="Times New Roman" w:hAnsi="Times New Roman" w:cs="Times New Roman"/>
+                <w:noProof/>
+                <w:webHidden/>
+                <w:sz w:val="28"/>
+                <w:szCs w:val="28"/>
+              </w:rPr>
+              <w:fldChar w:fldCharType="begin"/>
+            </w:r>
+            <w:r>
+              <w:rPr>
+                <w:rFonts w:ascii="Times New Roman" w:hAnsi="Times New Roman" w:cs="Times New Roman"/>
+                <w:noProof/>
+                <w:webHidden/>
+                <w:sz w:val="28"/>
+                <w:szCs w:val="28"/>
+              </w:rPr>
+              <w:instrText xml:space="preserve"> PAGEREF _Toc232646698 \h </w:instrText>
+            </w:r>
+            <w:r>
+              <w:rPr>
+                <w:rFonts w:ascii="Times New Roman" w:hAnsi="Times New Roman" w:cs="Times New Roman"/>
+                <w:noProof/>
+                <w:webHidden/>
+                <w:sz w:val="28"/>
+                <w:szCs w:val="28"/>
+              </w:rPr>
+            </w:r>
+            <w:r>
+              <w:rPr>
+                <w:rFonts w:ascii="Times New Roman" w:hAnsi="Times New Roman" w:cs="Times New Roman"/>
+                <w:noProof/>
+                <w:webHidden/>
+                <w:sz w:val="28"/>
+                <w:szCs w:val="28"/>
+              </w:rPr>
+              <w:fldChar w:fldCharType="separate"/>
+            </w:r>
+            <w:r>
+              <w:rPr>
+                <w:rFonts w:ascii="Times New Roman" w:hAnsi="Times New Roman" w:cs="Times New Roman"/>
+                <w:noProof/>
+                <w:webHidden/>
+                <w:sz w:val="28"/>
+                <w:szCs w:val="28"/>
+              </w:rPr>
+              <w:t>5</w:t>
+            </w:r>
+            <w:r>
+              <w:rPr>
+                <w:rFonts w:ascii="Times New Roman" w:hAnsi="Times New Roman" w:cs="Times New Roman"/>
+                <w:noProof/>
+                <w:webHidden/>
+                <w:sz w:val="28"/>
+                <w:szCs w:val="28"/>
+              </w:rPr>
+              <w:fldChar w:fldCharType="end"/>
+            </w:r>
+          </w:hyperlink>
         </w:p>
         <w:p>
           <w:pPr>
@@ -2966,119 +2946,89 @@
               <w:szCs w:val="28"/>
             </w:rPr>
           </w:pPr>
-          <w:r>
-            <w:rPr>
-              <w:noProof/>
-            </w:rPr>
-            <w:fldChar w:fldCharType="begin"/>
-          </w:r>
-          <w:r>
-            <w:rPr>
-              <w:noProof/>
-            </w:rPr>
-            <w:instrText xml:space="preserve"> HYPERLINK \l "_Toc232646699" </w:instrText>
-          </w:r>
-          <w:r>
-            <w:rPr>
-              <w:noProof/>
-            </w:rPr>
-          </w:r>
-          <w:r>
-            <w:rPr>
-              <w:noProof/>
-            </w:rPr>
-            <w:fldChar w:fldCharType="separate"/>
-          </w:r>
-          <w:r>
-            <w:rPr>
-              <w:rStyle w:val="ad"/>
-              <w:rFonts w:ascii="Times New Roman" w:eastAsia="Times New Roman" w:hAnsi="Times New Roman" w:cs="Times New Roman"/>
-              <w:b/>
-              <w:bCs/>
-              <w:noProof/>
-              <w:sz w:val="28"/>
-              <w:szCs w:val="28"/>
-            </w:rPr>
-            <w:t>1. ТЕОРЕТИЧЕСКАЯ ЧАСТЬ</w:t>
-          </w:r>
-          <w:r>
-            <w:rPr>
-              <w:rFonts w:ascii="Times New Roman" w:hAnsi="Times New Roman" w:cs="Times New Roman"/>
-              <w:noProof/>
-              <w:webHidden/>
-              <w:sz w:val="28"/>
-              <w:szCs w:val="28"/>
-            </w:rPr>
-            <w:tab/>
-          </w:r>
-          <w:r>
-            <w:rPr>
-              <w:rFonts w:ascii="Times New Roman" w:hAnsi="Times New Roman" w:cs="Times New Roman"/>
-              <w:noProof/>
-              <w:webHidden/>
-              <w:sz w:val="28"/>
-              <w:szCs w:val="28"/>
-            </w:rPr>
-            <w:fldChar w:fldCharType="begin"/>
-          </w:r>
-          <w:r>
-            <w:rPr>
-              <w:rFonts w:ascii="Times New Roman" w:hAnsi="Times New Roman" w:cs="Times New Roman"/>
-              <w:noProof/>
-              <w:webHidden/>
-              <w:sz w:val="28"/>
-              <w:szCs w:val="28"/>
-            </w:rPr>
-            <w:instrText xml:space="preserve"> PAGEREF _Toc232646699 \h </w:instrText>
-          </w:r>
-          <w:r>
-            <w:rPr>
-              <w:rFonts w:ascii="Times New Roman" w:hAnsi="Times New Roman" w:cs="Times New Roman"/>
-              <w:noProof/>
-              <w:webHidden/>
-              <w:sz w:val="28"/>
-              <w:szCs w:val="28"/>
-            </w:rPr>
-          </w:r>
-          <w:r>
-            <w:rPr>
-              <w:rFonts w:ascii="Times New Roman" w:hAnsi="Times New Roman" w:cs="Times New Roman"/>
-              <w:noProof/>
-              <w:webHidden/>
-              <w:sz w:val="28"/>
-              <w:szCs w:val="28"/>
-            </w:rPr>
-            <w:fldChar w:fldCharType="separate"/>
-          </w:r>
-          <w:r>
-            <w:rPr>
-              <w:rFonts w:ascii="Times New Roman" w:hAnsi="Times New Roman" w:cs="Times New Roman"/>
-              <w:noProof/>
-              <w:webHidden/>
-              <w:sz w:val="28"/>
-              <w:szCs w:val="28"/>
-            </w:rPr>
-            <w:t>7</w:t>
-          </w:r>
-          <w:r>
-            <w:rPr>
-              <w:rFonts w:ascii="Times New Roman" w:hAnsi="Times New Roman" w:cs="Times New Roman"/>
-              <w:noProof/>
-              <w:webHidden/>
-              <w:sz w:val="28"/>
-              <w:szCs w:val="28"/>
-            </w:rPr>
-            <w:fldChar w:fldCharType="end"/>
-          </w:r>
-          <w:r>
-            <w:rPr>
-              <w:rFonts w:ascii="Times New Roman" w:hAnsi="Times New Roman" w:cs="Times New Roman"/>
-              <w:noProof/>
-              <w:sz w:val="28"/>
-              <w:szCs w:val="28"/>
-            </w:rPr>
-            <w:fldChar w:fldCharType="end"/>
-          </w:r>
+          <w:hyperlink w:anchor="_Toc232646699" w:history="1">
+            <w:r>
+              <w:rPr>
+                <w:rStyle w:val="ad"/>
+                <w:rFonts w:ascii="Times New Roman" w:eastAsia="Times New Roman" w:hAnsi="Times New Roman" w:cs="Times New Roman"/>
+                <w:b/>
+                <w:bCs/>
+                <w:noProof/>
+                <w:sz w:val="28"/>
+                <w:szCs w:val="28"/>
+              </w:rPr>
+              <w:t>1. ТЕОРЕТИЧЕСКАЯ ЧАСТЬ</w:t>
+            </w:r>
+            <w:r>
+              <w:rPr>
+                <w:rFonts w:ascii="Times New Roman" w:hAnsi="Times New Roman" w:cs="Times New Roman"/>
+                <w:noProof/>
+                <w:webHidden/>
+                <w:sz w:val="28"/>
+                <w:szCs w:val="28"/>
+              </w:rPr>
+              <w:tab/>
+            </w:r>
+            <w:r>
+              <w:rPr>
+                <w:rFonts w:ascii="Times New Roman" w:hAnsi="Times New Roman" w:cs="Times New Roman"/>
+                <w:noProof/>
+                <w:webHidden/>
+                <w:sz w:val="28"/>
+                <w:szCs w:val="28"/>
+              </w:rPr>
+              <w:fldChar w:fldCharType="begin"/>
+            </w:r>
+            <w:r>
+              <w:rPr>
+                <w:rFonts w:ascii="Times New Roman" w:hAnsi="Times New Roman" w:cs="Times New Roman"/>
+                <w:noProof/>
+                <w:webHidden/>
+                <w:sz w:val="28"/>
+                <w:szCs w:val="28"/>
+              </w:rPr>
+              <w:instrText xml:space="preserve"> PAGEREF _Toc232646699 \h </w:instrText>
+            </w:r>
+            <w:r>
+              <w:rPr>
+                <w:rFonts w:ascii="Times New Roman" w:hAnsi="Times New Roman" w:cs="Times New Roman"/>
+                <w:noProof/>
+                <w:webHidden/>
+                <w:sz w:val="28"/>
+                <w:szCs w:val="28"/>
+              </w:rPr>
+            </w:r>
+            <w:r>
+              <w:rPr>
+                <w:rFonts w:ascii="Times New Roman" w:hAnsi="Times New Roman" w:cs="Times New Roman"/>
+                <w:noProof/>
+                <w:webHidden/>
+                <w:sz w:val="28"/>
+                <w:szCs w:val="28"/>
+              </w:rPr>
+              <w:fldChar w:fldCharType="separate"/>
+            </w:r>
+            <w:r>
+              <w:rPr>
+                <w:rFonts w:ascii="Times New Roman" w:hAnsi="Times New Roman" w:cs="Times New Roman"/>
+                <w:noProof/>
+                <w:webHidden/>
+                <w:sz w:val="28"/>
+                <w:szCs w:val="28"/>
+              </w:rPr>
+              <w:t>7</w:t>
+            </w:r>
+            <w:r>
+              <w:rPr>
+                <w:rFonts w:ascii="Times New Roman" w:hAnsi="Times New Roman" w:cs="Times New Roman"/>
+                <w:noProof/>
+                <w:webHidden/>
+                <w:sz w:val="28"/>
+                <w:szCs w:val="28"/>
+              </w:rPr>
+              <w:fldChar w:fldCharType="end"/>
+            </w:r>
+          </w:hyperlink>
         </w:p>
         <w:p>
           <w:pPr>

</xml_diff>